<commit_message>
Wire SD/W25Q128 storage and SX1268 (E22-400M30S SPI) radio into flight firmware; add ground bridge, compact radio frame, host tests, docs
</commit_message>
<xml_diff>
--- a/AirOne_Firmware_CanSat/AirOne_Firmware_CanSat/docs/hardware_connection.docx
+++ b/AirOne_Firmware_CanSat/AirOne_Firmware_CanSat/docs/hardware_connection.docx
@@ -2,13 +2,13 @@
 <file path=word/document.xml><?xml version="1.0" encoding="utf-8"?>
 <w:document xmlns:w="http://schemas.openxmlformats.org/wordprocessingml/2006/main" xmlns:m="http://schemas.openxmlformats.org/officeDocument/2006/math" xmlns:r="http://schemas.openxmlformats.org/officeDocument/2006/relationships" xmlns:o="urn:schemas-microsoft-com:office:office" xmlns:v="urn:schemas-microsoft-com:vml" xmlns:w10="urn:schemas-microsoft-com:office:word" xmlns:a="http://schemas.openxmlformats.org/drawingml/2006/main" xmlns:pic="http://schemas.openxmlformats.org/drawingml/2006/picture" xmlns:wp="http://schemas.openxmlformats.org/drawingml/2006/wordprocessingDrawing">
   <w:body>
-    <w:bookmarkStart w:id="30" w:name="Xa8198e507c638d4437f560bf88f297888dd0430"/>
+    <w:bookmarkStart w:id="30" w:name="Xef62b834f1bf4ab6d3d2a1fb722a4dcb2cf6f2a"/>
     <w:p>
       <w:pPr>
         <w:pStyle w:val="Heading1"/>
       </w:pPr>
       <w:r>
-        <w:t xml:space="preserve">AirOne — Connecting a Real CanSat (LoRa E22 over USB)</w:t>
+        <w:t xml:space="preserve">AirOne — Connecting a Real CanSat (E22-400M30S SPI + USB ground bridge)</w:t>
       </w:r>
     </w:p>
     <w:p>
@@ -38,7 +38,7 @@
         <w:t xml:space="preserve"> </w:t>
       </w:r>
       <w:r>
-        <w:t xml:space="preserve">your laptop using a</w:t>
+        <w:t xml:space="preserve">your laptop. The CanSat and the ground station each use an</w:t>
       </w:r>
       <w:r>
         <w:t xml:space="preserve"> </w:t>
@@ -48,35 +48,141 @@
           <w:bCs/>
           <w:b/>
         </w:rPr>
-        <w:t xml:space="preserve">LoRa E22</w:t>
-      </w:r>
-      <w:r>
-        <w:t xml:space="preserve"> </w:t>
-      </w:r>
-      <w:r>
-        <w:t xml:space="preserve">module connected via a</w:t>
-      </w:r>
-      <w:r>
-        <w:t xml:space="preserve"> </w:t>
+        <w:t xml:space="preserve">EBYTE</w:t>
       </w:r>
       <w:r>
         <w:rPr>
           <w:bCs/>
           <w:b/>
         </w:rPr>
-        <w:t xml:space="preserve">USB-to-serial</w:t>
-      </w:r>
-      <w:r>
-        <w:t xml:space="preserve"> </w:t>
-      </w:r>
-      <w:r>
-        <w:t xml:space="preserve">bridge. It covers wiring, E22 configuration, launching the ground station in</w:t>
-      </w:r>
-      <w:r>
-        <w:t xml:space="preserve"> </w:t>
-      </w:r>
-      <w:r>
-        <w:t xml:space="preserve">live mode, and troubleshooting.</w:t>
+        <w:t xml:space="preserve"> </w:t>
+      </w:r>
+      <w:r>
+        <w:rPr>
+          <w:bCs/>
+          <w:b/>
+        </w:rPr>
+        <w:t xml:space="preserve">E22-400M30S</w:t>
+      </w:r>
+      <w:r>
+        <w:t xml:space="preserve"> </w:t>
+      </w:r>
+      <w:r>
+        <w:t xml:space="preserve">(Semtech SX1268,</w:t>
+      </w:r>
+      <w:r>
+        <w:t xml:space="preserve"> </w:t>
+      </w:r>
+      <w:r>
+        <w:rPr>
+          <w:bCs/>
+          <w:b/>
+        </w:rPr>
+        <w:t xml:space="preserve">SPI-only</w:t>
+      </w:r>
+      <w:r>
+        <w:t xml:space="preserve">) driven by an ESP32. The ground</w:t>
+      </w:r>
+      <w:r>
+        <w:t xml:space="preserve"> </w:t>
+      </w:r>
+      <w:r>
+        <w:t xml:space="preserve">ESP32 runs</w:t>
+      </w:r>
+      <w:r>
+        <w:t xml:space="preserve"> </w:t>
+      </w:r>
+      <w:r>
+        <w:rPr>
+          <w:rStyle w:val="VerbatimChar"/>
+        </w:rPr>
+        <w:t xml:space="preserve">airone_ground_bridge/</w:t>
+      </w:r>
+      <w:r>
+        <w:t xml:space="preserve"> </w:t>
+      </w:r>
+      <w:r>
+        <w:t xml:space="preserve">and appears on your laptop as a USB serial</w:t>
+      </w:r>
+      <w:r>
+        <w:t xml:space="preserve"> </w:t>
+      </w:r>
+      <w:r>
+        <w:t xml:space="preserve">port. The guide covers wiring, radio parameters, launching the ground station</w:t>
+      </w:r>
+      <w:r>
+        <w:t xml:space="preserve"> </w:t>
+      </w:r>
+      <w:r>
+        <w:t xml:space="preserve">in live mode, and troubleshooting.</w:t>
+      </w:r>
+    </w:p>
+    <w:p>
+      <w:pPr>
+        <w:pStyle w:val="BlockText"/>
+      </w:pPr>
+      <w:r>
+        <w:rPr>
+          <w:bCs/>
+          <w:b/>
+        </w:rPr>
+        <w:t xml:space="preserve">Status.</w:t>
+      </w:r>
+      <w:r>
+        <w:t xml:space="preserve"> </w:t>
+      </w:r>
+      <w:r>
+        <w:t xml:space="preserve">The SPI radio driver and the ground bridge compile and pass the</w:t>
+      </w:r>
+      <w:r>
+        <w:t xml:space="preserve"> </w:t>
+      </w:r>
+      <w:r>
+        <w:t xml:space="preserve">host tests. They have</w:t>
+      </w:r>
+      <w:r>
+        <w:t xml:space="preserve"> </w:t>
+      </w:r>
+      <w:r>
+        <w:rPr>
+          <w:bCs/>
+          <w:b/>
+        </w:rPr>
+        <w:t xml:space="preserve">not</w:t>
+      </w:r>
+      <w:r>
+        <w:t xml:space="preserve"> </w:t>
+      </w:r>
+      <w:r>
+        <w:t xml:space="preserve">been tested on hardware yet. The radio pin</w:t>
+      </w:r>
+      <w:r>
+        <w:t xml:space="preserve"> </w:t>
+      </w:r>
+      <w:r>
+        <w:t xml:space="preserve">assignment below is an</w:t>
+      </w:r>
+      <w:r>
+        <w:t xml:space="preserve"> </w:t>
+      </w:r>
+      <w:r>
+        <w:rPr>
+          <w:bCs/>
+          <w:b/>
+        </w:rPr>
+        <w:t xml:space="preserve">assumption</w:t>
+      </w:r>
+      <w:r>
+        <w:t xml:space="preserve"> </w:t>
+      </w:r>
+      <w:r>
+        <w:t xml:space="preserve">— check it against your PCB before you</w:t>
+      </w:r>
+      <w:r>
+        <w:t xml:space="preserve"> </w:t>
+      </w:r>
+      <w:r>
+        <w:t xml:space="preserve">power anything up.</w:t>
       </w:r>
     </w:p>
     <w:p>
@@ -175,7 +281,7 @@
         <w:rPr>
           <w:rStyle w:val="VerbatimChar"/>
         </w:rPr>
-        <w:t xml:space="preserve">[CanSat: ESP32 + sensors + E22 (air)]  ~~LoRa RF~~  [E22 (ground) + USB-serial]  -&gt;  laptop USB</w:t>
+        <w:t xml:space="preserve">[CanSat: ESP32 + sensors + E22-400M30S]  ~~LoRa 433.92 MHz~~  [E22-400M30S + ESP32 ground bridge]  --USB--&gt;  laptop</w:t>
       </w:r>
       <w:r>
         <w:br/>
@@ -184,7 +290,7 @@
         <w:rPr>
           <w:rStyle w:val="VerbatimChar"/>
         </w:rPr>
-        <w:t xml:space="preserve">                                                                                        |</w:t>
+        <w:t xml:space="preserve">                                                                                                           |</w:t>
       </w:r>
       <w:r>
         <w:br/>
@@ -193,7 +299,7 @@
         <w:rPr>
           <w:rStyle w:val="VerbatimChar"/>
         </w:rPr>
-        <w:t xml:space="preserve">                                                            AirOne ground station (launcher.py)</w:t>
+        <w:t xml:space="preserve">                                                                              AirOne ground station (launcher.py)</w:t>
       </w:r>
     </w:p>
     <w:p>
@@ -215,13 +321,13 @@
           <w:bCs/>
           <w:b/>
         </w:rPr>
-        <w:t xml:space="preserve">flight E22</w:t>
-      </w:r>
-      <w:r>
-        <w:t xml:space="preserve"> </w:t>
-      </w:r>
-      <w:r>
-        <w:t xml:space="preserve">is driven by the ESP32 firmware in</w:t>
+        <w:t xml:space="preserve">flight radio</w:t>
+      </w:r>
+      <w:r>
+        <w:t xml:space="preserve"> </w:t>
+      </w:r>
+      <w:r>
+        <w:t xml:space="preserve">is driven over SPI by RadioLib in</w:t>
       </w:r>
       <w:r>
         <w:t xml:space="preserve"> </w:t>
@@ -230,10 +336,56 @@
         <w:rPr>
           <w:rStyle w:val="VerbatimChar"/>
         </w:rPr>
-        <w:t xml:space="preserve">firmware/airone_cansat/</w:t>
-      </w:r>
-      <w:r>
-        <w:t xml:space="preserve">.</w:t>
+        <w:t xml:space="preserve">airone_cansat/airone_radio.h</w:t>
+      </w:r>
+      <w:r>
+        <w:t xml:space="preserve">. Every 2 Hz sample is logged in full (JSON</w:t>
+      </w:r>
+      <w:r>
+        <w:t xml:space="preserve"> </w:t>
+      </w:r>
+      <w:r>
+        <w:t xml:space="preserve">frame) to MicroSD/W25Q128. Over the air the CanSat sends a</w:t>
+      </w:r>
+      <w:r>
+        <w:t xml:space="preserve"> </w:t>
+      </w:r>
+      <w:r>
+        <w:rPr>
+          <w:bCs/>
+          <w:b/>
+        </w:rPr>
+        <w:t xml:space="preserve">compact frame</w:t>
+      </w:r>
+      <w:r>
+        <w:t xml:space="preserve"> </w:t>
+      </w:r>
+      <w:r>
+        <w:t xml:space="preserve">(payload type</w:t>
+      </w:r>
+      <w:r>
+        <w:t xml:space="preserve"> </w:t>
+      </w:r>
+      <w:r>
+        <w:rPr>
+          <w:rStyle w:val="VerbatimChar"/>
+        </w:rPr>
+        <w:t xml:space="preserve">0x10</w:t>
+      </w:r>
+      <w:r>
+        <w:t xml:space="preserve">, ≤ 255 B, HMAC-signed when a link key is set). The</w:t>
+      </w:r>
+      <w:r>
+        <w:t xml:space="preserve"> </w:t>
+      </w:r>
+      <w:r>
+        <w:t xml:space="preserve">10 % duty-cycle limiter sets the real air rate: about one frame every</w:t>
+      </w:r>
+      <w:r>
+        <w:t xml:space="preserve"> </w:t>
+      </w:r>
+      <w:r>
+        <w:t xml:space="preserve">~1.6 s at SF7/BW250. That figure is an estimate.</w:t>
       </w:r>
     </w:p>
     <w:p>
@@ -255,19 +407,101 @@
           <w:bCs/>
           <w:b/>
         </w:rPr>
-        <w:t xml:space="preserve">ground E22</w:t>
-      </w:r>
-      <w:r>
-        <w:t xml:space="preserve"> </w:t>
-      </w:r>
-      <w:r>
-        <w:t xml:space="preserve">is wired to a USB-serial bridge (CP210x / CH340 / FTDI)</w:t>
-      </w:r>
-      <w:r>
-        <w:t xml:space="preserve"> </w:t>
-      </w:r>
-      <w:r>
-        <w:t xml:space="preserve">and appears on your laptop as a serial port.</w:t>
+        <w:t xml:space="preserve">ground bridge</w:t>
+      </w:r>
+      <w:r>
+        <w:t xml:space="preserve"> </w:t>
+      </w:r>
+      <w:r>
+        <w:t xml:space="preserve">(</w:t>
+      </w:r>
+      <w:r>
+        <w:rPr>
+          <w:rStyle w:val="VerbatimChar"/>
+        </w:rPr>
+        <w:t xml:space="preserve">airone_ground_bridge/</w:t>
+      </w:r>
+      <w:r>
+        <w:t xml:space="preserve">) receives the compact frame</w:t>
+      </w:r>
+      <w:r>
+        <w:t xml:space="preserve"> </w:t>
+      </w:r>
+      <w:r>
+        <w:t xml:space="preserve">and verifies CRC/HMAC. It drops duplicate sequence numbers, expands the frame</w:t>
+      </w:r>
+      <w:r>
+        <w:t xml:space="preserve"> </w:t>
+      </w:r>
+      <w:r>
+        <w:t xml:space="preserve">to the normal JSON sensor payload (adding ground-measured</w:t>
+      </w:r>
+      <w:r>
+        <w:t xml:space="preserve"> </w:t>
+      </w:r>
+      <w:r>
+        <w:rPr>
+          <w:rStyle w:val="VerbatimChar"/>
+        </w:rPr>
+        <w:t xml:space="preserve">radio_rssi</w:t>
+      </w:r>
+      <w:r>
+        <w:t xml:space="preserve"> </w:t>
+      </w:r>
+      <w:r>
+        <w:t xml:space="preserve">/</w:t>
+      </w:r>
+      <w:r>
+        <w:t xml:space="preserve"> </w:t>
+      </w:r>
+      <w:r>
+        <w:rPr>
+          <w:rStyle w:val="VerbatimChar"/>
+        </w:rPr>
+        <w:t xml:space="preserve">radio_snr</w:t>
+      </w:r>
+      <w:r>
+        <w:t xml:space="preserve">) and writes a</w:t>
+      </w:r>
+      <w:r>
+        <w:t xml:space="preserve"> </w:t>
+      </w:r>
+      <w:r>
+        <w:t xml:space="preserve">standard</w:t>
+      </w:r>
+      <w:r>
+        <w:t xml:space="preserve"> </w:t>
+      </w:r>
+      <w:r>
+        <w:rPr>
+          <w:rStyle w:val="VerbatimChar"/>
+        </w:rPr>
+        <w:t xml:space="preserve">PT_SENSOR_DATA</w:t>
+      </w:r>
+      <w:r>
+        <w:t xml:space="preserve"> </w:t>
+      </w:r>
+      <w:r>
+        <w:t xml:space="preserve">frame to USB serial at</w:t>
+      </w:r>
+      <w:r>
+        <w:t xml:space="preserve"> </w:t>
+      </w:r>
+      <w:r>
+        <w:rPr>
+          <w:bCs/>
+          <w:b/>
+        </w:rPr>
+        <w:t xml:space="preserve">115200 baud</w:t>
+      </w:r>
+      <w:r>
+        <w:t xml:space="preserve">. The ground</w:t>
+      </w:r>
+      <w:r>
+        <w:t xml:space="preserve"> </w:t>
+      </w:r>
+      <w:r>
+        <w:t xml:space="preserve">station sees exactly the same binary framing as before.</w:t>
       </w:r>
     </w:p>
     <w:p>
@@ -279,7 +513,7 @@
         <w:pStyle w:val="Compact"/>
       </w:pPr>
       <w:r>
-        <w:t xml:space="preserve">Both E22 modules must share the</w:t>
+        <w:t xml:space="preserve">Both radios must share the</w:t>
       </w:r>
       <w:r>
         <w:t xml:space="preserve"> </w:t>
@@ -289,35 +523,25 @@
           <w:bCs/>
           <w:b/>
         </w:rPr>
-        <w:t xml:space="preserve">same</w:t>
-      </w:r>
-      <w:r>
-        <w:t xml:space="preserve"> </w:t>
-      </w:r>
-      <w:r>
-        <w:t xml:space="preserve">RF settings (frequency channel,</w:t>
-      </w:r>
-      <w:r>
-        <w:t xml:space="preserve"> </w:t>
-      </w:r>
-      <w:r>
-        <w:t xml:space="preserve">address, air data rate) and the</w:t>
-      </w:r>
-      <w:r>
-        <w:t xml:space="preserve"> </w:t>
-      </w:r>
-      <w:r>
-        <w:rPr>
-          <w:bCs/>
-          <w:b/>
-        </w:rPr>
-        <w:t xml:space="preserve">same UART baud</w:t>
-      </w:r>
-      <w:r>
-        <w:t xml:space="preserve"> </w:t>
-      </w:r>
-      <w:r>
-        <w:t xml:space="preserve">as the ground station.</w:t>
+        <w:t xml:space="preserve">same LoRa parameters</w:t>
+      </w:r>
+      <w:r>
+        <w:t xml:space="preserve"> </w:t>
+      </w:r>
+      <w:r>
+        <w:t xml:space="preserve">(section 4). The E22</w:t>
+      </w:r>
+      <w:r>
+        <w:t xml:space="preserve"> </w:t>
+      </w:r>
+      <w:r>
+        <w:t xml:space="preserve">has no UART mode, no M0/M1 pins and no module-level address/channel</w:t>
+      </w:r>
+      <w:r>
+        <w:t xml:space="preserve"> </w:t>
+      </w:r>
+      <w:r>
+        <w:t xml:space="preserve">configuration.</w:t>
       </w:r>
     </w:p>
     <w:p>
@@ -328,13 +552,13 @@
       </w:r>
     </w:p>
     <w:bookmarkEnd w:id="20"/>
-    <w:bookmarkStart w:id="21" w:name="ground-side-wiring-e22-usb-serial-bridge"/>
+    <w:bookmarkStart w:id="21" w:name="X2000ec64ead47916620ebd3422b594762f6fab7"/>
     <w:p>
       <w:pPr>
         <w:pStyle w:val="Heading2"/>
       </w:pPr>
       <w:r>
-        <w:t xml:space="preserve">2. Ground-side wiring (E22 ↔ USB-serial bridge)</w:t>
+        <w:t xml:space="preserve">2. Ground-side wiring (E22-400M30S ↔ ground-bridge ESP32)</w:t>
       </w:r>
     </w:p>
     <w:p>
@@ -342,46 +566,58 @@
         <w:pStyle w:val="FirstParagraph"/>
       </w:pPr>
       <w:r>
-        <w:t xml:space="preserve">Put the E22 in</w:t>
-      </w:r>
-      <w:r>
-        <w:t xml:space="preserve"> </w:t>
-      </w:r>
-      <w:r>
-        <w:rPr>
-          <w:bCs/>
-          <w:b/>
-        </w:rPr>
-        <w:t xml:space="preserve">transparent mode</w:t>
-      </w:r>
-      <w:r>
-        <w:t xml:space="preserve"> </w:t>
-      </w:r>
-      <w:r>
-        <w:t xml:space="preserve">(M0 = M1 = GND). In transparent mode the</w:t>
-      </w:r>
-      <w:r>
-        <w:t xml:space="preserve"> </w:t>
-      </w:r>
-      <w:r>
-        <w:t xml:space="preserve">E22 passes bytes through unchanged — exactly what the AirOne binary protocol</w:t>
-      </w:r>
-      <w:r>
-        <w:t xml:space="preserve"> </w:t>
-      </w:r>
-      <w:r>
-        <w:t xml:space="preserve">needs.</w:t>
+        <w:t xml:space="preserve">Any ESP32 dev board with a CP210x/CH340 USB bridge works. The ground station</w:t>
+      </w:r>
+      <w:r>
+        <w:t xml:space="preserve"> </w:t>
+      </w:r>
+      <w:r>
+        <w:t xml:space="preserve">auto-discovers those USB chips. The bridge uses the same pin defaults as the</w:t>
+      </w:r>
+      <w:r>
+        <w:t xml:space="preserve"> </w:t>
+      </w:r>
+      <w:r>
+        <w:t xml:space="preserve">flight board, and you can override each one with a</w:t>
+      </w:r>
+      <w:r>
+        <w:t xml:space="preserve"> </w:t>
+      </w:r>
+      <w:r>
+        <w:rPr>
+          <w:rStyle w:val="VerbatimChar"/>
+        </w:rPr>
+        <w:t xml:space="preserve">-D</w:t>
+      </w:r>
+      <w:r>
+        <w:t xml:space="preserve"> </w:t>
+      </w:r>
+      <w:r>
+        <w:t xml:space="preserve">build flag (see</w:t>
+      </w:r>
+      <w:r>
+        <w:t xml:space="preserve"> </w:t>
+      </w:r>
+      <w:r>
+        <w:rPr>
+          <w:rStyle w:val="VerbatimChar"/>
+        </w:rPr>
+        <w:t xml:space="preserve">airone_radio.h</w:t>
+      </w:r>
+      <w:r>
+        <w:t xml:space="preserve">).</w:t>
       </w:r>
     </w:p>
     <w:tbl>
       <w:tblPr>
         <w:tblStyle w:val="Table"/>
-        <w:tblW w:type="auto" w:w="0"/>
+        <w:tblW w:type="pct" w:w="5000"/>
         <w:tblLook w:firstRow="1" w:lastRow="0" w:firstColumn="0" w:lastColumn="0" w:noHBand="0" w:noVBand="0" w:val="0020"/>
       </w:tblPr>
       <w:tblGrid>
-        <w:gridCol w:w="3960"/>
-        <w:gridCol w:w="3960"/>
+        <w:gridCol w:w="3846"/>
+        <w:gridCol w:w="2489"/>
+        <w:gridCol w:w="1584"/>
       </w:tblGrid>
       <w:tr>
         <w:trPr>
@@ -395,19 +631,31 @@
               <w:jc w:val="left"/>
             </w:pPr>
             <w:r>
-              <w:t xml:space="preserve">E22 pin</w:t>
-            </w:r>
-          </w:p>
-        </w:tc>
-        <w:tc>
-          <w:tcPr/>
-          <w:p>
-            <w:pPr>
-              <w:pStyle w:val="Compact"/>
-              <w:jc w:val="left"/>
-            </w:pPr>
-            <w:r>
-              <w:t xml:space="preserve">Connect to (USB-serial bridge)</w:t>
+              <w:t xml:space="preserve">E22-400M30S pin</w:t>
+            </w:r>
+          </w:p>
+        </w:tc>
+        <w:tc>
+          <w:tcPr/>
+          <w:p>
+            <w:pPr>
+              <w:pStyle w:val="Compact"/>
+              <w:jc w:val="left"/>
+            </w:pPr>
+            <w:r>
+              <w:t xml:space="preserve">ESP32 pin</w:t>
+            </w:r>
+          </w:p>
+        </w:tc>
+        <w:tc>
+          <w:tcPr/>
+          <w:p>
+            <w:pPr>
+              <w:pStyle w:val="Compact"/>
+              <w:jc w:val="left"/>
+            </w:pPr>
+            <w:r>
+              <w:t xml:space="preserve">Notes</w:t>
             </w:r>
           </w:p>
         </w:tc>
@@ -433,7 +681,19 @@
               <w:jc w:val="left"/>
             </w:pPr>
             <w:r>
-              <w:t xml:space="preserve">3.3 V (E22 is 3.3 V logic)</w:t>
+              <w:t xml:space="preserve">supply per the E22-400M30S datasheet (≈ 30 dBm PA draws several hundred mA in TX)</w:t>
+            </w:r>
+          </w:p>
+        </w:tc>
+        <w:tc>
+          <w:tcPr/>
+          <w:p>
+            <w:pPr>
+              <w:pStyle w:val="Compact"/>
+              <w:jc w:val="left"/>
+            </w:pPr>
+            <w:r>
+              <w:t xml:space="preserve">Check the datasheet before connecting</w:t>
             </w:r>
           </w:p>
         </w:tc>
@@ -463,6 +723,14 @@
             </w:r>
           </w:p>
         </w:tc>
+        <w:tc>
+          <w:tcPr/>
+          <w:p>
+            <w:pPr>
+              <w:pStyle w:val="Compact"/>
+            </w:pPr>
+          </w:p>
+        </w:tc>
       </w:tr>
       <w:tr>
         <w:tc>
@@ -473,19 +741,31 @@
               <w:jc w:val="left"/>
             </w:pPr>
             <w:r>
-              <w:t xml:space="preserve">TXD</w:t>
-            </w:r>
-          </w:p>
-        </w:tc>
-        <w:tc>
-          <w:tcPr/>
-          <w:p>
-            <w:pPr>
-              <w:pStyle w:val="Compact"/>
-              <w:jc w:val="left"/>
-            </w:pPr>
-            <w:r>
-              <w:t xml:space="preserve">RXD of the bridge</w:t>
+              <w:t xml:space="preserve">SCK</w:t>
+            </w:r>
+          </w:p>
+        </w:tc>
+        <w:tc>
+          <w:tcPr/>
+          <w:p>
+            <w:pPr>
+              <w:pStyle w:val="Compact"/>
+              <w:jc w:val="left"/>
+            </w:pPr>
+            <w:r>
+              <w:t xml:space="preserve">GPIO18</w:t>
+            </w:r>
+          </w:p>
+        </w:tc>
+        <w:tc>
+          <w:tcPr/>
+          <w:p>
+            <w:pPr>
+              <w:pStyle w:val="Compact"/>
+              <w:jc w:val="left"/>
+            </w:pPr>
+            <w:r>
+              <w:t xml:space="preserve">VSPI</w:t>
             </w:r>
           </w:p>
         </w:tc>
@@ -499,19 +779,31 @@
               <w:jc w:val="left"/>
             </w:pPr>
             <w:r>
-              <w:t xml:space="preserve">RXD</w:t>
-            </w:r>
-          </w:p>
-        </w:tc>
-        <w:tc>
-          <w:tcPr/>
-          <w:p>
-            <w:pPr>
-              <w:pStyle w:val="Compact"/>
-              <w:jc w:val="left"/>
-            </w:pPr>
-            <w:r>
-              <w:t xml:space="preserve">TXD of the bridge</w:t>
+              <w:t xml:space="preserve">MISO</w:t>
+            </w:r>
+          </w:p>
+        </w:tc>
+        <w:tc>
+          <w:tcPr/>
+          <w:p>
+            <w:pPr>
+              <w:pStyle w:val="Compact"/>
+              <w:jc w:val="left"/>
+            </w:pPr>
+            <w:r>
+              <w:t xml:space="preserve">GPIO19</w:t>
+            </w:r>
+          </w:p>
+        </w:tc>
+        <w:tc>
+          <w:tcPr/>
+          <w:p>
+            <w:pPr>
+              <w:pStyle w:val="Compact"/>
+              <w:jc w:val="left"/>
+            </w:pPr>
+            <w:r>
+              <w:t xml:space="preserve">VSPI</w:t>
             </w:r>
           </w:p>
         </w:tc>
@@ -525,19 +817,31 @@
               <w:jc w:val="left"/>
             </w:pPr>
             <w:r>
-              <w:t xml:space="preserve">M0</w:t>
-            </w:r>
-          </w:p>
-        </w:tc>
-        <w:tc>
-          <w:tcPr/>
-          <w:p>
-            <w:pPr>
-              <w:pStyle w:val="Compact"/>
-              <w:jc w:val="left"/>
-            </w:pPr>
-            <w:r>
-              <w:t xml:space="preserve">GND (transparent mode)</w:t>
+              <w:t xml:space="preserve">MOSI</w:t>
+            </w:r>
+          </w:p>
+        </w:tc>
+        <w:tc>
+          <w:tcPr/>
+          <w:p>
+            <w:pPr>
+              <w:pStyle w:val="Compact"/>
+              <w:jc w:val="left"/>
+            </w:pPr>
+            <w:r>
+              <w:t xml:space="preserve">GPIO23</w:t>
+            </w:r>
+          </w:p>
+        </w:tc>
+        <w:tc>
+          <w:tcPr/>
+          <w:p>
+            <w:pPr>
+              <w:pStyle w:val="Compact"/>
+              <w:jc w:val="left"/>
+            </w:pPr>
+            <w:r>
+              <w:t xml:space="preserve">VSPI</w:t>
             </w:r>
           </w:p>
         </w:tc>
@@ -551,19 +855,34 @@
               <w:jc w:val="left"/>
             </w:pPr>
             <w:r>
-              <w:t xml:space="preserve">M1</w:t>
-            </w:r>
-          </w:p>
-        </w:tc>
-        <w:tc>
-          <w:tcPr/>
-          <w:p>
-            <w:pPr>
-              <w:pStyle w:val="Compact"/>
-              <w:jc w:val="left"/>
-            </w:pPr>
-            <w:r>
-              <w:t xml:space="preserve">GND (transparent mode)</w:t>
+              <w:t xml:space="preserve">NSS</w:t>
+            </w:r>
+          </w:p>
+        </w:tc>
+        <w:tc>
+          <w:tcPr/>
+          <w:p>
+            <w:pPr>
+              <w:pStyle w:val="Compact"/>
+              <w:jc w:val="left"/>
+            </w:pPr>
+            <w:r>
+              <w:t xml:space="preserve">GPIO13</w:t>
+            </w:r>
+          </w:p>
+        </w:tc>
+        <w:tc>
+          <w:tcPr/>
+          <w:p>
+            <w:pPr>
+              <w:pStyle w:val="Compact"/>
+              <w:jc w:val="left"/>
+            </w:pPr>
+            <w:r>
+              <w:rPr>
+                <w:rStyle w:val="VerbatimChar"/>
+              </w:rPr>
+              <w:t xml:space="preserve">RADIO_PIN_NSS</w:t>
             </w:r>
           </w:p>
         </w:tc>
@@ -577,19 +896,261 @@
               <w:jc w:val="left"/>
             </w:pPr>
             <w:r>
-              <w:t xml:space="preserve">AUX</w:t>
-            </w:r>
-          </w:p>
-        </w:tc>
-        <w:tc>
-          <w:tcPr/>
-          <w:p>
-            <w:pPr>
-              <w:pStyle w:val="Compact"/>
-              <w:jc w:val="left"/>
-            </w:pPr>
-            <w:r>
-              <w:t xml:space="preserve">(optional) leave unconnected for basic RX</w:t>
+              <w:t xml:space="preserve">BUSY</w:t>
+            </w:r>
+          </w:p>
+        </w:tc>
+        <w:tc>
+          <w:tcPr/>
+          <w:p>
+            <w:pPr>
+              <w:pStyle w:val="Compact"/>
+              <w:jc w:val="left"/>
+            </w:pPr>
+            <w:r>
+              <w:t xml:space="preserve">GPIO27</w:t>
+            </w:r>
+          </w:p>
+        </w:tc>
+        <w:tc>
+          <w:tcPr/>
+          <w:p>
+            <w:pPr>
+              <w:pStyle w:val="Compact"/>
+              <w:jc w:val="left"/>
+            </w:pPr>
+            <w:r>
+              <w:rPr>
+                <w:rStyle w:val="VerbatimChar"/>
+              </w:rPr>
+              <w:t xml:space="preserve">RADIO_PIN_BUSY</w:t>
+            </w:r>
+          </w:p>
+        </w:tc>
+      </w:tr>
+      <w:tr>
+        <w:tc>
+          <w:tcPr/>
+          <w:p>
+            <w:pPr>
+              <w:pStyle w:val="Compact"/>
+              <w:jc w:val="left"/>
+            </w:pPr>
+            <w:r>
+              <w:t xml:space="preserve">DIO1</w:t>
+            </w:r>
+          </w:p>
+        </w:tc>
+        <w:tc>
+          <w:tcPr/>
+          <w:p>
+            <w:pPr>
+              <w:pStyle w:val="Compact"/>
+              <w:jc w:val="left"/>
+            </w:pPr>
+            <w:r>
+              <w:t xml:space="preserve">GPIO35</w:t>
+            </w:r>
+          </w:p>
+        </w:tc>
+        <w:tc>
+          <w:tcPr/>
+          <w:p>
+            <w:pPr>
+              <w:pStyle w:val="Compact"/>
+              <w:jc w:val="left"/>
+            </w:pPr>
+            <w:r>
+              <w:rPr>
+                <w:rStyle w:val="VerbatimChar"/>
+              </w:rPr>
+              <w:t xml:space="preserve">RADIO_PIN_DIO1</w:t>
+            </w:r>
+            <w:r>
+              <w:t xml:space="preserve"> </w:t>
+            </w:r>
+            <w:r>
+              <w:t xml:space="preserve">(input-only pin, IRQ)</w:t>
+            </w:r>
+          </w:p>
+        </w:tc>
+      </w:tr>
+      <w:tr>
+        <w:tc>
+          <w:tcPr/>
+          <w:p>
+            <w:pPr>
+              <w:pStyle w:val="Compact"/>
+              <w:jc w:val="left"/>
+            </w:pPr>
+            <w:r>
+              <w:t xml:space="preserve">NRST</w:t>
+            </w:r>
+          </w:p>
+        </w:tc>
+        <w:tc>
+          <w:tcPr/>
+          <w:p>
+            <w:pPr>
+              <w:pStyle w:val="Compact"/>
+              <w:jc w:val="left"/>
+            </w:pPr>
+            <w:r>
+              <w:t xml:space="preserve">not connected</w:t>
+            </w:r>
+          </w:p>
+        </w:tc>
+        <w:tc>
+          <w:tcPr/>
+          <w:p>
+            <w:pPr>
+              <w:pStyle w:val="Compact"/>
+              <w:jc w:val="left"/>
+            </w:pPr>
+            <w:r>
+              <w:rPr>
+                <w:rStyle w:val="VerbatimChar"/>
+              </w:rPr>
+              <w:t xml:space="preserve">RADIO_PIN_NRST=-1</w:t>
+            </w:r>
+            <w:r>
+              <w:t xml:space="preserve">; connect one and set the flag if you want hardware reset</w:t>
+            </w:r>
+          </w:p>
+        </w:tc>
+      </w:tr>
+      <w:tr>
+        <w:tc>
+          <w:tcPr/>
+          <w:p>
+            <w:pPr>
+              <w:pStyle w:val="Compact"/>
+              <w:jc w:val="left"/>
+            </w:pPr>
+            <w:r>
+              <w:t xml:space="preserve">RXEN</w:t>
+            </w:r>
+          </w:p>
+        </w:tc>
+        <w:tc>
+          <w:tcPr/>
+          <w:p>
+            <w:pPr>
+              <w:pStyle w:val="Compact"/>
+              <w:jc w:val="left"/>
+            </w:pPr>
+            <w:r>
+              <w:t xml:space="preserve">GPIO14</w:t>
+            </w:r>
+          </w:p>
+        </w:tc>
+        <w:tc>
+          <w:tcPr/>
+          <w:p>
+            <w:pPr>
+              <w:pStyle w:val="Compact"/>
+              <w:jc w:val="left"/>
+            </w:pPr>
+            <w:r>
+              <w:rPr>
+                <w:rStyle w:val="VerbatimChar"/>
+              </w:rPr>
+              <w:t xml:space="preserve">RADIO_PIN_RXEN</w:t>
+            </w:r>
+            <w:r>
+              <w:t xml:space="preserve"> </w:t>
+            </w:r>
+            <w:r>
+              <w:t xml:space="preserve">– RF switch, RX path</w:t>
+            </w:r>
+          </w:p>
+        </w:tc>
+      </w:tr>
+      <w:tr>
+        <w:tc>
+          <w:tcPr/>
+          <w:p>
+            <w:pPr>
+              <w:pStyle w:val="Compact"/>
+              <w:jc w:val="left"/>
+            </w:pPr>
+            <w:r>
+              <w:t xml:space="preserve">TXEN</w:t>
+            </w:r>
+          </w:p>
+        </w:tc>
+        <w:tc>
+          <w:tcPr/>
+          <w:p>
+            <w:pPr>
+              <w:pStyle w:val="Compact"/>
+              <w:jc w:val="left"/>
+            </w:pPr>
+            <w:r>
+              <w:t xml:space="preserve">GPIO33</w:t>
+            </w:r>
+          </w:p>
+        </w:tc>
+        <w:tc>
+          <w:tcPr/>
+          <w:p>
+            <w:pPr>
+              <w:pStyle w:val="Compact"/>
+              <w:jc w:val="left"/>
+            </w:pPr>
+            <w:r>
+              <w:rPr>
+                <w:rStyle w:val="VerbatimChar"/>
+              </w:rPr>
+              <w:t xml:space="preserve">RADIO_PIN_TXEN</w:t>
+            </w:r>
+            <w:r>
+              <w:t xml:space="preserve"> </w:t>
+            </w:r>
+            <w:r>
+              <w:t xml:space="preserve">– RF switch, TX path</w:t>
+            </w:r>
+          </w:p>
+        </w:tc>
+      </w:tr>
+      <w:tr>
+        <w:tc>
+          <w:tcPr/>
+          <w:p>
+            <w:pPr>
+              <w:pStyle w:val="Compact"/>
+              <w:jc w:val="left"/>
+            </w:pPr>
+            <w:r>
+              <w:t xml:space="preserve">ANT</w:t>
+            </w:r>
+          </w:p>
+        </w:tc>
+        <w:tc>
+          <w:tcPr/>
+          <w:p>
+            <w:pPr>
+              <w:pStyle w:val="Compact"/>
+              <w:jc w:val="left"/>
+            </w:pPr>
+            <w:r>
+              <w:t xml:space="preserve">433 MHz antenna</w:t>
+            </w:r>
+          </w:p>
+        </w:tc>
+        <w:tc>
+          <w:tcPr/>
+          <w:p>
+            <w:pPr>
+              <w:pStyle w:val="Compact"/>
+              <w:jc w:val="left"/>
+            </w:pPr>
+            <w:r>
+              <w:rPr>
+                <w:bCs/>
+                <w:b/>
+              </w:rPr>
+              <w:t xml:space="preserve">Never key the PA without an antenna/load attached</w:t>
             </w:r>
           </w:p>
         </w:tc>
@@ -600,7 +1161,75 @@
         <w:pStyle w:val="BlockText"/>
       </w:pPr>
       <w:r>
-        <w:t xml:space="preserve">Use a 3.3 V USB-serial bridge. Feeding 5 V into E22 RXD can damage the module.</w:t>
+        <w:t xml:space="preserve">The E22-400M30S uses 3.3 V logic. Do not drive its pins from 5 V logic</w:t>
+      </w:r>
+      <w:r>
+        <w:t xml:space="preserve"> </w:t>
+      </w:r>
+      <w:r>
+        <w:t xml:space="preserve">(ESP32 GPIOs are 3.3 V, so a direct connection is fine).</w:t>
+      </w:r>
+    </w:p>
+    <w:p>
+      <w:pPr>
+        <w:pStyle w:val="FirstParagraph"/>
+      </w:pPr>
+      <w:r>
+        <w:t xml:space="preserve">Flash the bridge with</w:t>
+      </w:r>
+      <w:r>
+        <w:t xml:space="preserve"> </w:t>
+      </w:r>
+      <w:r>
+        <w:rPr>
+          <w:rStyle w:val="VerbatimChar"/>
+        </w:rPr>
+        <w:t xml:space="preserve">arduino-cli compile/upload -b esp32:esp32:esp32 airone_ground_bridge</w:t>
+      </w:r>
+      <w:r>
+        <w:t xml:space="preserve">. If the flight unit uses an HMAC link key, build with</w:t>
+      </w:r>
+      <w:r>
+        <w:t xml:space="preserve"> </w:t>
+      </w:r>
+      <w:r>
+        <w:t xml:space="preserve">the same key (</w:t>
+      </w:r>
+      <w:r>
+        <w:rPr>
+          <w:rStyle w:val="VerbatimChar"/>
+        </w:rPr>
+        <w:t xml:space="preserve">AIRONE_LINK_KEY_HEX</w:t>
+      </w:r>
+      <w:r>
+        <w:t xml:space="preserve">). Build with</w:t>
+      </w:r>
+      <w:r>
+        <w:t xml:space="preserve"> </w:t>
+      </w:r>
+      <w:r>
+        <w:rPr>
+          <w:rStyle w:val="VerbatimChar"/>
+        </w:rPr>
+        <w:t xml:space="preserve">-DBRIDGE_DEBUG=1</w:t>
+      </w:r>
+      <w:r>
+        <w:t xml:space="preserve"> </w:t>
+      </w:r>
+      <w:r>
+        <w:t xml:space="preserve">to get</w:t>
+      </w:r>
+      <w:r>
+        <w:t xml:space="preserve"> </w:t>
+      </w:r>
+      <w:r>
+        <w:t xml:space="preserve">per-packet text in a serial monitor. Leave it off when the ground station is</w:t>
+      </w:r>
+      <w:r>
+        <w:t xml:space="preserve"> </w:t>
+      </w:r>
+      <w:r>
+        <w:t xml:space="preserve">reading the port, because text breaks the binary stream.</w:t>
       </w:r>
     </w:p>
     <w:p>
@@ -611,13 +1240,13 @@
       </w:r>
     </w:p>
     <w:bookmarkEnd w:id="21"/>
-    <w:bookmarkStart w:id="22" w:name="flight-side-wiring-esp32-e22"/>
+    <w:bookmarkStart w:id="22" w:name="X4a6bca7a1760d69708a22a8cf8bfd68dcc8f8d7"/>
     <w:p>
       <w:pPr>
         <w:pStyle w:val="Heading2"/>
       </w:pPr>
       <w:r>
-        <w:t xml:space="preserve">3. Flight-side wiring (ESP32 ↔ E22)</w:t>
+        <w:t xml:space="preserve">3. Flight-side wiring (ESP32-WROVER ↔ E22-400M30S)</w:t>
       </w:r>
     </w:p>
     <w:p>
@@ -637,7 +1266,49 @@
         <w:t xml:space="preserve">airone_cansat/airone_cansat.ino</w:t>
       </w:r>
       <w:r>
-        <w:t xml:space="preserve">:</w:t>
+        <w:t xml:space="preserve"> </w:t>
+      </w:r>
+      <w:r>
+        <w:t xml:space="preserve">/</w:t>
+      </w:r>
+      <w:r>
+        <w:t xml:space="preserve"> </w:t>
+      </w:r>
+      <w:r>
+        <w:rPr>
+          <w:rStyle w:val="VerbatimChar"/>
+        </w:rPr>
+        <w:t xml:space="preserve">airone_radio.h</w:t>
+      </w:r>
+      <w:r>
+        <w:t xml:space="preserve">. The</w:t>
+      </w:r>
+      <w:r>
+        <w:t xml:space="preserve"> </w:t>
+      </w:r>
+      <w:r>
+        <w:t xml:space="preserve">radio shares the VSPI bus with the BMI270 (CS GPIO15), MicroSD (CS GPIO5) and</w:t>
+      </w:r>
+      <w:r>
+        <w:t xml:space="preserve"> </w:t>
+      </w:r>
+      <w:r>
+        <w:t xml:space="preserve">W25Q128 (CS GPIO4). A FreeRTOS mutex (</w:t>
+      </w:r>
+      <w:r>
+        <w:rPr>
+          <w:rStyle w:val="VerbatimChar"/>
+        </w:rPr>
+        <w:t xml:space="preserve">airone_spibus.h</w:t>
+      </w:r>
+      <w:r>
+        <w:t xml:space="preserve">) serialises all bus</w:t>
+      </w:r>
+      <w:r>
+        <w:t xml:space="preserve"> </w:t>
+      </w:r>
+      <w:r>
+        <w:t xml:space="preserve">access.</w:t>
       </w:r>
     </w:p>
     <w:tbl>
@@ -701,31 +1372,31 @@
               <w:jc w:val="left"/>
             </w:pPr>
             <w:r>
-              <w:t xml:space="preserve">GPIO17 (UART1 TX)</w:t>
-            </w:r>
-          </w:p>
-        </w:tc>
-        <w:tc>
-          <w:tcPr/>
-          <w:p>
-            <w:pPr>
-              <w:pStyle w:val="Compact"/>
-              <w:jc w:val="left"/>
-            </w:pPr>
-            <w:r>
-              <w:t xml:space="preserve">RXD</w:t>
-            </w:r>
-          </w:p>
-        </w:tc>
-        <w:tc>
-          <w:tcPr/>
-          <w:p>
-            <w:pPr>
-              <w:pStyle w:val="Compact"/>
-              <w:jc w:val="left"/>
-            </w:pPr>
-            <w:r>
-              <w:t xml:space="preserve">ESP32 → E22</w:t>
+              <w:t xml:space="preserve">GPIO18 / 19 / 23</w:t>
+            </w:r>
+          </w:p>
+        </w:tc>
+        <w:tc>
+          <w:tcPr/>
+          <w:p>
+            <w:pPr>
+              <w:pStyle w:val="Compact"/>
+              <w:jc w:val="left"/>
+            </w:pPr>
+            <w:r>
+              <w:t xml:space="preserve">SCK / MISO / MOSI</w:t>
+            </w:r>
+          </w:p>
+        </w:tc>
+        <w:tc>
+          <w:tcPr/>
+          <w:p>
+            <w:pPr>
+              <w:pStyle w:val="Compact"/>
+              <w:jc w:val="left"/>
+            </w:pPr>
+            <w:r>
+              <w:t xml:space="preserve">shared VSPI</w:t>
             </w:r>
           </w:p>
         </w:tc>
@@ -739,31 +1410,31 @@
               <w:jc w:val="left"/>
             </w:pPr>
             <w:r>
-              <w:t xml:space="preserve">GPIO16 (UART1 RX)</w:t>
-            </w:r>
-          </w:p>
-        </w:tc>
-        <w:tc>
-          <w:tcPr/>
-          <w:p>
-            <w:pPr>
-              <w:pStyle w:val="Compact"/>
-              <w:jc w:val="left"/>
-            </w:pPr>
-            <w:r>
-              <w:t xml:space="preserve">TXD</w:t>
-            </w:r>
-          </w:p>
-        </w:tc>
-        <w:tc>
-          <w:tcPr/>
-          <w:p>
-            <w:pPr>
-              <w:pStyle w:val="Compact"/>
-              <w:jc w:val="left"/>
-            </w:pPr>
-            <w:r>
-              <w:t xml:space="preserve">E22 → ESP32</w:t>
+              <w:t xml:space="preserve">GPIO13</w:t>
+            </w:r>
+          </w:p>
+        </w:tc>
+        <w:tc>
+          <w:tcPr/>
+          <w:p>
+            <w:pPr>
+              <w:pStyle w:val="Compact"/>
+              <w:jc w:val="left"/>
+            </w:pPr>
+            <w:r>
+              <w:t xml:space="preserve">NSS</w:t>
+            </w:r>
+          </w:p>
+        </w:tc>
+        <w:tc>
+          <w:tcPr/>
+          <w:p>
+            <w:pPr>
+              <w:pStyle w:val="Compact"/>
+              <w:jc w:val="left"/>
+            </w:pPr>
+            <w:r>
+              <w:t xml:space="preserve">driven HIGH at boot, before any SPI traffic</w:t>
             </w:r>
           </w:p>
         </w:tc>
@@ -777,32 +1448,28 @@
               <w:jc w:val="left"/>
             </w:pPr>
             <w:r>
-              <w:t xml:space="preserve">GPIO13</w:t>
-            </w:r>
-          </w:p>
-        </w:tc>
-        <w:tc>
-          <w:tcPr/>
-          <w:p>
-            <w:pPr>
-              <w:pStyle w:val="Compact"/>
-              <w:jc w:val="left"/>
-            </w:pPr>
-            <w:r>
-              <w:t xml:space="preserve">M0</w:t>
-            </w:r>
-          </w:p>
-        </w:tc>
-        <w:tc>
-          <w:tcPr/>
-          <w:p>
-            <w:pPr>
-              <w:pStyle w:val="Compact"/>
-              <w:jc w:val="left"/>
-            </w:pPr>
-            <w:r>
-              <w:t xml:space="preserve">driven LOW (transparent mode)</w:t>
-            </w:r>
+              <w:t xml:space="preserve">GPIO27</w:t>
+            </w:r>
+          </w:p>
+        </w:tc>
+        <w:tc>
+          <w:tcPr/>
+          <w:p>
+            <w:pPr>
+              <w:pStyle w:val="Compact"/>
+              <w:jc w:val="left"/>
+            </w:pPr>
+            <w:r>
+              <w:t xml:space="preserve">BUSY</w:t>
+            </w:r>
+          </w:p>
+        </w:tc>
+        <w:tc>
+          <w:tcPr/>
+          <w:p>
+            <w:pPr>
+              <w:pStyle w:val="Compact"/>
+            </w:pPr>
           </w:p>
         </w:tc>
       </w:tr>
@@ -815,31 +1482,31 @@
               <w:jc w:val="left"/>
             </w:pPr>
             <w:r>
-              <w:t xml:space="preserve">GPIO14</w:t>
-            </w:r>
-          </w:p>
-        </w:tc>
-        <w:tc>
-          <w:tcPr/>
-          <w:p>
-            <w:pPr>
-              <w:pStyle w:val="Compact"/>
-              <w:jc w:val="left"/>
-            </w:pPr>
-            <w:r>
-              <w:t xml:space="preserve">M1</w:t>
-            </w:r>
-          </w:p>
-        </w:tc>
-        <w:tc>
-          <w:tcPr/>
-          <w:p>
-            <w:pPr>
-              <w:pStyle w:val="Compact"/>
-              <w:jc w:val="left"/>
-            </w:pPr>
-            <w:r>
-              <w:t xml:space="preserve">driven LOW (transparent mode)</w:t>
+              <w:t xml:space="preserve">GPIO35</w:t>
+            </w:r>
+          </w:p>
+        </w:tc>
+        <w:tc>
+          <w:tcPr/>
+          <w:p>
+            <w:pPr>
+              <w:pStyle w:val="Compact"/>
+              <w:jc w:val="left"/>
+            </w:pPr>
+            <w:r>
+              <w:t xml:space="preserve">DIO1</w:t>
+            </w:r>
+          </w:p>
+        </w:tc>
+        <w:tc>
+          <w:tcPr/>
+          <w:p>
+            <w:pPr>
+              <w:pStyle w:val="Compact"/>
+              <w:jc w:val="left"/>
+            </w:pPr>
+            <w:r>
+              <w:t xml:space="preserve">input-only, TX-done/RX-done IRQ</w:t>
             </w:r>
           </w:p>
         </w:tc>
@@ -853,31 +1520,31 @@
               <w:jc w:val="left"/>
             </w:pPr>
             <w:r>
-              <w:t xml:space="preserve">GPIO35</w:t>
-            </w:r>
-          </w:p>
-        </w:tc>
-        <w:tc>
-          <w:tcPr/>
-          <w:p>
-            <w:pPr>
-              <w:pStyle w:val="Compact"/>
-              <w:jc w:val="left"/>
-            </w:pPr>
-            <w:r>
-              <w:t xml:space="preserve">AUX</w:t>
-            </w:r>
-          </w:p>
-        </w:tc>
-        <w:tc>
-          <w:tcPr/>
-          <w:p>
-            <w:pPr>
-              <w:pStyle w:val="Compact"/>
-              <w:jc w:val="left"/>
-            </w:pPr>
-            <w:r>
-              <w:t xml:space="preserve">busy line, input-only (external pull-up)</w:t>
+              <w:t xml:space="preserve">—</w:t>
+            </w:r>
+          </w:p>
+        </w:tc>
+        <w:tc>
+          <w:tcPr/>
+          <w:p>
+            <w:pPr>
+              <w:pStyle w:val="Compact"/>
+              <w:jc w:val="left"/>
+            </w:pPr>
+            <w:r>
+              <w:t xml:space="preserve">NRST</w:t>
+            </w:r>
+          </w:p>
+        </w:tc>
+        <w:tc>
+          <w:tcPr/>
+          <w:p>
+            <w:pPr>
+              <w:pStyle w:val="Compact"/>
+              <w:jc w:val="left"/>
+            </w:pPr>
+            <w:r>
+              <w:t xml:space="preserve">not connected (assumed)</w:t>
             </w:r>
           </w:p>
         </w:tc>
@@ -891,28 +1558,32 @@
               <w:jc w:val="left"/>
             </w:pPr>
             <w:r>
-              <w:t xml:space="preserve">3.3 V</w:t>
-            </w:r>
-          </w:p>
-        </w:tc>
-        <w:tc>
-          <w:tcPr/>
-          <w:p>
-            <w:pPr>
-              <w:pStyle w:val="Compact"/>
-              <w:jc w:val="left"/>
-            </w:pPr>
-            <w:r>
-              <w:t xml:space="preserve">VCC</w:t>
-            </w:r>
-          </w:p>
-        </w:tc>
-        <w:tc>
-          <w:tcPr/>
-          <w:p>
-            <w:pPr>
-              <w:pStyle w:val="Compact"/>
-            </w:pPr>
+              <w:t xml:space="preserve">GPIO14</w:t>
+            </w:r>
+          </w:p>
+        </w:tc>
+        <w:tc>
+          <w:tcPr/>
+          <w:p>
+            <w:pPr>
+              <w:pStyle w:val="Compact"/>
+              <w:jc w:val="left"/>
+            </w:pPr>
+            <w:r>
+              <w:t xml:space="preserve">RXEN</w:t>
+            </w:r>
+          </w:p>
+        </w:tc>
+        <w:tc>
+          <w:tcPr/>
+          <w:p>
+            <w:pPr>
+              <w:pStyle w:val="Compact"/>
+              <w:jc w:val="left"/>
+            </w:pPr>
+            <w:r>
+              <w:t xml:space="preserve">driven LOW at boot</w:t>
+            </w:r>
           </w:p>
         </w:tc>
       </w:tr>
@@ -925,6 +1596,78 @@
               <w:jc w:val="left"/>
             </w:pPr>
             <w:r>
+              <w:t xml:space="preserve">GPIO33</w:t>
+            </w:r>
+          </w:p>
+        </w:tc>
+        <w:tc>
+          <w:tcPr/>
+          <w:p>
+            <w:pPr>
+              <w:pStyle w:val="Compact"/>
+              <w:jc w:val="left"/>
+            </w:pPr>
+            <w:r>
+              <w:t xml:space="preserve">TXEN</w:t>
+            </w:r>
+          </w:p>
+        </w:tc>
+        <w:tc>
+          <w:tcPr/>
+          <w:p>
+            <w:pPr>
+              <w:pStyle w:val="Compact"/>
+              <w:jc w:val="left"/>
+            </w:pPr>
+            <w:r>
+              <w:t xml:space="preserve">driven LOW at boot</w:t>
+            </w:r>
+          </w:p>
+        </w:tc>
+      </w:tr>
+      <w:tr>
+        <w:tc>
+          <w:tcPr/>
+          <w:p>
+            <w:pPr>
+              <w:pStyle w:val="Compact"/>
+              <w:jc w:val="left"/>
+            </w:pPr>
+            <w:r>
+              <w:t xml:space="preserve">3.3 V</w:t>
+            </w:r>
+          </w:p>
+        </w:tc>
+        <w:tc>
+          <w:tcPr/>
+          <w:p>
+            <w:pPr>
+              <w:pStyle w:val="Compact"/>
+              <w:jc w:val="left"/>
+            </w:pPr>
+            <w:r>
+              <w:t xml:space="preserve">VCC</w:t>
+            </w:r>
+          </w:p>
+        </w:tc>
+        <w:tc>
+          <w:tcPr/>
+          <w:p>
+            <w:pPr>
+              <w:pStyle w:val="Compact"/>
+            </w:pPr>
+          </w:p>
+        </w:tc>
+      </w:tr>
+      <w:tr>
+        <w:tc>
+          <w:tcPr/>
+          <w:p>
+            <w:pPr>
+              <w:pStyle w:val="Compact"/>
+              <w:jc w:val="left"/>
+            </w:pPr>
+            <w:r>
               <w:t xml:space="preserve">GND</w:t>
             </w:r>
           </w:p>
@@ -953,7 +1696,61 @@
     </w:tbl>
     <w:p>
       <w:pPr>
-        <w:pStyle w:val="BodyText"/>
+        <w:pStyle w:val="BlockText"/>
+      </w:pPr>
+      <w:r>
+        <w:rPr>
+          <w:bCs/>
+          <w:b/>
+        </w:rPr>
+        <w:t xml:space="preserve">Pin assumption — verify.</w:t>
+      </w:r>
+      <w:r>
+        <w:t xml:space="preserve"> </w:t>
+      </w:r>
+      <w:r>
+        <w:t xml:space="preserve">An older V7.1 map put RXEN on GPIO32,</w:t>
+      </w:r>
+      <w:r>
+        <w:t xml:space="preserve"> </w:t>
+      </w:r>
+      <w:r>
+        <w:t xml:space="preserve">NRST on GPIO16 and DIO1 on GPIO17. On V8.0 those pins clash: GPIO32 is the</w:t>
+      </w:r>
+      <w:r>
+        <w:t xml:space="preserve"> </w:t>
+      </w:r>
+      <w:r>
+        <w:t xml:space="preserve">TPS3823 WDI, and GPIO16/17 are used by the WROVER’s PSRAM. The firmware</w:t>
+      </w:r>
+      <w:r>
+        <w:t xml:space="preserve"> </w:t>
+      </w:r>
+      <w:r>
+        <w:t xml:space="preserve">therefore re-uses the old UART-E22 pads: M0→RXEN (14), M1 pad→NSS (13),</w:t>
+      </w:r>
+      <w:r>
+        <w:t xml:space="preserve"> </w:t>
+      </w:r>
+      <w:r>
+        <w:t xml:space="preserve">AUX→DIO1 (35). If your PCB is routed differently, set</w:t>
+      </w:r>
+      <w:r>
+        <w:t xml:space="preserve"> </w:t>
+      </w:r>
+      <w:r>
+        <w:rPr>
+          <w:rStyle w:val="VerbatimChar"/>
+        </w:rPr>
+        <w:t xml:space="preserve">-DRADIO_PIN_*</w:t>
+      </w:r>
+      <w:r>
+        <w:t xml:space="preserve">.</w:t>
+      </w:r>
+    </w:p>
+    <w:p>
+      <w:pPr>
+        <w:pStyle w:val="FirstParagraph"/>
       </w:pPr>
       <w:r>
         <w:t xml:space="preserve">The MAX-M10S GNSS is on UART2 (ESP32 RX = GPIO25, TX = GPIO26). I²C sensors</w:t>
@@ -991,13 +1788,13 @@
       </w:r>
     </w:p>
     <w:bookmarkEnd w:id="22"/>
-    <w:bookmarkStart w:id="23" w:name="e22-baud-rate-must-match"/>
+    <w:bookmarkStart w:id="23" w:name="Xe7541fe3cbf73572b200d4a9256224078420612"/>
     <w:p>
       <w:pPr>
         <w:pStyle w:val="Heading2"/>
       </w:pPr>
       <w:r>
-        <w:t xml:space="preserve">4. E22 baud rate must match</w:t>
+        <w:t xml:space="preserve">4. LoRa parameters must match (bridge USB baud is fixed at 115200)</w:t>
       </w:r>
     </w:p>
     <w:p>
@@ -1005,7 +1802,461 @@
         <w:pStyle w:val="FirstParagraph"/>
       </w:pPr>
       <w:r>
-        <w:t xml:space="preserve">The E22’s</w:t>
+        <w:t xml:space="preserve">Both sketches take their RF settings from</w:t>
+      </w:r>
+      <w:r>
+        <w:t xml:space="preserve"> </w:t>
+      </w:r>
+      <w:r>
+        <w:rPr>
+          <w:rStyle w:val="VerbatimChar"/>
+        </w:rPr>
+        <w:t xml:space="preserve">airone_radio.h</w:t>
+      </w:r>
+      <w:r>
+        <w:t xml:space="preserve">. The run-script</w:t>
+      </w:r>
+      <w:r>
+        <w:t xml:space="preserve"> </w:t>
+      </w:r>
+      <w:r>
+        <w:t xml:space="preserve">checks that the copies are identical. If you change a parameter, change it in</w:t>
+      </w:r>
+      <w:r>
+        <w:t xml:space="preserve"> </w:t>
+      </w:r>
+      <w:r>
+        <w:t xml:space="preserve">both builds:</w:t>
+      </w:r>
+    </w:p>
+    <w:tbl>
+      <w:tblPr>
+        <w:tblStyle w:val="Table"/>
+        <w:tblW w:type="pct" w:w="5000"/>
+        <w:tblLook w:firstRow="1" w:lastRow="0" w:firstColumn="0" w:lastColumn="0" w:noHBand="0" w:noVBand="0" w:val="0020"/>
+      </w:tblPr>
+      <w:tblGrid>
+        <w:gridCol w:w="3350"/>
+        <w:gridCol w:w="2741"/>
+        <w:gridCol w:w="1827"/>
+      </w:tblGrid>
+      <w:tr>
+        <w:trPr>
+          <w:tblHeader w:val="true"/>
+        </w:trPr>
+        <w:tc>
+          <w:tcPr/>
+          <w:p>
+            <w:pPr>
+              <w:pStyle w:val="Compact"/>
+              <w:jc w:val="left"/>
+            </w:pPr>
+            <w:r>
+              <w:t xml:space="preserve">Parameter</w:t>
+            </w:r>
+          </w:p>
+        </w:tc>
+        <w:tc>
+          <w:tcPr/>
+          <w:p>
+            <w:pPr>
+              <w:pStyle w:val="Compact"/>
+              <w:jc w:val="left"/>
+            </w:pPr>
+            <w:r>
+              <w:t xml:space="preserve">Default</w:t>
+            </w:r>
+          </w:p>
+        </w:tc>
+        <w:tc>
+          <w:tcPr/>
+          <w:p>
+            <w:pPr>
+              <w:pStyle w:val="Compact"/>
+              <w:jc w:val="left"/>
+            </w:pPr>
+            <w:r>
+              <w:t xml:space="preserve">Flag</w:t>
+            </w:r>
+          </w:p>
+        </w:tc>
+      </w:tr>
+      <w:tr>
+        <w:tc>
+          <w:tcPr/>
+          <w:p>
+            <w:pPr>
+              <w:pStyle w:val="Compact"/>
+              <w:jc w:val="left"/>
+            </w:pPr>
+            <w:r>
+              <w:t xml:space="preserve">Frequency</w:t>
+            </w:r>
+          </w:p>
+        </w:tc>
+        <w:tc>
+          <w:tcPr/>
+          <w:p>
+            <w:pPr>
+              <w:pStyle w:val="Compact"/>
+              <w:jc w:val="left"/>
+            </w:pPr>
+            <w:r>
+              <w:t xml:space="preserve">433.92 MHz</w:t>
+            </w:r>
+          </w:p>
+        </w:tc>
+        <w:tc>
+          <w:tcPr/>
+          <w:p>
+            <w:pPr>
+              <w:pStyle w:val="Compact"/>
+              <w:jc w:val="left"/>
+            </w:pPr>
+            <w:r>
+              <w:rPr>
+                <w:rStyle w:val="VerbatimChar"/>
+              </w:rPr>
+              <w:t xml:space="preserve">RADIO_FREQ_MHZ</w:t>
+            </w:r>
+          </w:p>
+        </w:tc>
+      </w:tr>
+      <w:tr>
+        <w:tc>
+          <w:tcPr/>
+          <w:p>
+            <w:pPr>
+              <w:pStyle w:val="Compact"/>
+              <w:jc w:val="left"/>
+            </w:pPr>
+            <w:r>
+              <w:t xml:space="preserve">Bandwidth</w:t>
+            </w:r>
+          </w:p>
+        </w:tc>
+        <w:tc>
+          <w:tcPr/>
+          <w:p>
+            <w:pPr>
+              <w:pStyle w:val="Compact"/>
+              <w:jc w:val="left"/>
+            </w:pPr>
+            <w:r>
+              <w:t xml:space="preserve">250 kHz</w:t>
+            </w:r>
+          </w:p>
+        </w:tc>
+        <w:tc>
+          <w:tcPr/>
+          <w:p>
+            <w:pPr>
+              <w:pStyle w:val="Compact"/>
+              <w:jc w:val="left"/>
+            </w:pPr>
+            <w:r>
+              <w:rPr>
+                <w:rStyle w:val="VerbatimChar"/>
+              </w:rPr>
+              <w:t xml:space="preserve">RADIO_BW_KHZ</w:t>
+            </w:r>
+          </w:p>
+        </w:tc>
+      </w:tr>
+      <w:tr>
+        <w:tc>
+          <w:tcPr/>
+          <w:p>
+            <w:pPr>
+              <w:pStyle w:val="Compact"/>
+              <w:jc w:val="left"/>
+            </w:pPr>
+            <w:r>
+              <w:t xml:space="preserve">Spreading factor</w:t>
+            </w:r>
+          </w:p>
+        </w:tc>
+        <w:tc>
+          <w:tcPr/>
+          <w:p>
+            <w:pPr>
+              <w:pStyle w:val="Compact"/>
+              <w:jc w:val="left"/>
+            </w:pPr>
+            <w:r>
+              <w:t xml:space="preserve">7</w:t>
+            </w:r>
+          </w:p>
+        </w:tc>
+        <w:tc>
+          <w:tcPr/>
+          <w:p>
+            <w:pPr>
+              <w:pStyle w:val="Compact"/>
+              <w:jc w:val="left"/>
+            </w:pPr>
+            <w:r>
+              <w:rPr>
+                <w:rStyle w:val="VerbatimChar"/>
+              </w:rPr>
+              <w:t xml:space="preserve">RADIO_SF</w:t>
+            </w:r>
+          </w:p>
+        </w:tc>
+      </w:tr>
+      <w:tr>
+        <w:tc>
+          <w:tcPr/>
+          <w:p>
+            <w:pPr>
+              <w:pStyle w:val="Compact"/>
+              <w:jc w:val="left"/>
+            </w:pPr>
+            <w:r>
+              <w:t xml:space="preserve">Coding rate</w:t>
+            </w:r>
+          </w:p>
+        </w:tc>
+        <w:tc>
+          <w:tcPr/>
+          <w:p>
+            <w:pPr>
+              <w:pStyle w:val="Compact"/>
+              <w:jc w:val="left"/>
+            </w:pPr>
+            <w:r>
+              <w:t xml:space="preserve">4/5</w:t>
+            </w:r>
+          </w:p>
+        </w:tc>
+        <w:tc>
+          <w:tcPr/>
+          <w:p>
+            <w:pPr>
+              <w:pStyle w:val="Compact"/>
+              <w:jc w:val="left"/>
+            </w:pPr>
+            <w:r>
+              <w:rPr>
+                <w:rStyle w:val="VerbatimChar"/>
+              </w:rPr>
+              <w:t xml:space="preserve">RADIO_CR</w:t>
+            </w:r>
+          </w:p>
+        </w:tc>
+      </w:tr>
+      <w:tr>
+        <w:tc>
+          <w:tcPr/>
+          <w:p>
+            <w:pPr>
+              <w:pStyle w:val="Compact"/>
+              <w:jc w:val="left"/>
+            </w:pPr>
+            <w:r>
+              <w:t xml:space="preserve">Sync word</w:t>
+            </w:r>
+          </w:p>
+        </w:tc>
+        <w:tc>
+          <w:tcPr/>
+          <w:p>
+            <w:pPr>
+              <w:pStyle w:val="Compact"/>
+              <w:jc w:val="left"/>
+            </w:pPr>
+            <w:r>
+              <w:t xml:space="preserve">0x12 (private)</w:t>
+            </w:r>
+          </w:p>
+        </w:tc>
+        <w:tc>
+          <w:tcPr/>
+          <w:p>
+            <w:pPr>
+              <w:pStyle w:val="Compact"/>
+              <w:jc w:val="left"/>
+            </w:pPr>
+            <w:r>
+              <w:rPr>
+                <w:rStyle w:val="VerbatimChar"/>
+              </w:rPr>
+              <w:t xml:space="preserve">RADIO_SYNC_WORD</w:t>
+            </w:r>
+          </w:p>
+        </w:tc>
+      </w:tr>
+      <w:tr>
+        <w:tc>
+          <w:tcPr/>
+          <w:p>
+            <w:pPr>
+              <w:pStyle w:val="Compact"/>
+              <w:jc w:val="left"/>
+            </w:pPr>
+            <w:r>
+              <w:t xml:space="preserve">Preamble</w:t>
+            </w:r>
+          </w:p>
+        </w:tc>
+        <w:tc>
+          <w:tcPr/>
+          <w:p>
+            <w:pPr>
+              <w:pStyle w:val="Compact"/>
+              <w:jc w:val="left"/>
+            </w:pPr>
+            <w:r>
+              <w:t xml:space="preserve">8 symbols</w:t>
+            </w:r>
+          </w:p>
+        </w:tc>
+        <w:tc>
+          <w:tcPr/>
+          <w:p>
+            <w:pPr>
+              <w:pStyle w:val="Compact"/>
+              <w:jc w:val="left"/>
+            </w:pPr>
+            <w:r>
+              <w:rPr>
+                <w:rStyle w:val="VerbatimChar"/>
+              </w:rPr>
+              <w:t xml:space="preserve">RADIO_PREAMBLE</w:t>
+            </w:r>
+          </w:p>
+        </w:tc>
+      </w:tr>
+      <w:tr>
+        <w:tc>
+          <w:tcPr/>
+          <w:p>
+            <w:pPr>
+              <w:pStyle w:val="Compact"/>
+              <w:jc w:val="left"/>
+            </w:pPr>
+            <w:r>
+              <w:t xml:space="preserve">TCXO</w:t>
+            </w:r>
+          </w:p>
+        </w:tc>
+        <w:tc>
+          <w:tcPr/>
+          <w:p>
+            <w:pPr>
+              <w:pStyle w:val="Compact"/>
+              <w:jc w:val="left"/>
+            </w:pPr>
+            <w:r>
+              <w:t xml:space="preserve">1.8 V</w:t>
+            </w:r>
+          </w:p>
+        </w:tc>
+        <w:tc>
+          <w:tcPr/>
+          <w:p>
+            <w:pPr>
+              <w:pStyle w:val="Compact"/>
+              <w:jc w:val="left"/>
+            </w:pPr>
+            <w:r>
+              <w:rPr>
+                <w:rStyle w:val="VerbatimChar"/>
+              </w:rPr>
+              <w:t xml:space="preserve">RADIO_TCXO_V</w:t>
+            </w:r>
+          </w:p>
+        </w:tc>
+      </w:tr>
+      <w:tr>
+        <w:tc>
+          <w:tcPr/>
+          <w:p>
+            <w:pPr>
+              <w:pStyle w:val="Compact"/>
+              <w:jc w:val="left"/>
+            </w:pPr>
+            <w:r>
+              <w:t xml:space="preserve">SX1268 output</w:t>
+            </w:r>
+          </w:p>
+        </w:tc>
+        <w:tc>
+          <w:tcPr/>
+          <w:p>
+            <w:pPr>
+              <w:pStyle w:val="Compact"/>
+              <w:jc w:val="left"/>
+            </w:pPr>
+            <w:r>
+              <w:t xml:space="preserve">−9 dBm (+ ~21 dB E22 PA ≈ +12 dBm ≈ 10 mW e.r.p. with a 0 dBi antenna, estimate)</w:t>
+            </w:r>
+          </w:p>
+        </w:tc>
+        <w:tc>
+          <w:tcPr/>
+          <w:p>
+            <w:pPr>
+              <w:pStyle w:val="Compact"/>
+              <w:jc w:val="left"/>
+            </w:pPr>
+            <w:r>
+              <w:rPr>
+                <w:rStyle w:val="VerbatimChar"/>
+              </w:rPr>
+              <w:t xml:space="preserve">RADIO_POWER_DBM</w:t>
+            </w:r>
+          </w:p>
+        </w:tc>
+      </w:tr>
+      <w:tr>
+        <w:tc>
+          <w:tcPr/>
+          <w:p>
+            <w:pPr>
+              <w:pStyle w:val="Compact"/>
+              <w:jc w:val="left"/>
+            </w:pPr>
+            <w:r>
+              <w:t xml:space="preserve">Duty cycle</w:t>
+            </w:r>
+          </w:p>
+        </w:tc>
+        <w:tc>
+          <w:tcPr/>
+          <w:p>
+            <w:pPr>
+              <w:pStyle w:val="Compact"/>
+              <w:jc w:val="left"/>
+            </w:pPr>
+            <w:r>
+              <w:t xml:space="preserve">10 %</w:t>
+            </w:r>
+          </w:p>
+        </w:tc>
+        <w:tc>
+          <w:tcPr/>
+          <w:p>
+            <w:pPr>
+              <w:pStyle w:val="Compact"/>
+              <w:jc w:val="left"/>
+            </w:pPr>
+            <w:r>
+              <w:rPr>
+                <w:rStyle w:val="VerbatimChar"/>
+              </w:rPr>
+              <w:t xml:space="preserve">RADIO_DUTY_PCT</w:t>
+            </w:r>
+          </w:p>
+        </w:tc>
+      </w:tr>
+    </w:tbl>
+    <w:p>
+      <w:pPr>
+        <w:pStyle w:val="BodyText"/>
+      </w:pPr>
+      <w:r>
+        <w:t xml:space="preserve">UK IR2030 (433.05–434.79 MHz) allows</w:t>
       </w:r>
       <w:r>
         <w:t xml:space="preserve"> </w:t>
@@ -1015,13 +2266,13 @@
           <w:bCs/>
           <w:b/>
         </w:rPr>
-        <w:t xml:space="preserve">UART baud</w:t>
-      </w:r>
-      <w:r>
-        <w:t xml:space="preserve"> </w:t>
-      </w:r>
-      <w:r>
-        <w:t xml:space="preserve">(module setting) and the AirOne</w:t>
+        <w:t xml:space="preserve">10 mW e.r.p.</w:t>
+      </w:r>
+      <w:r>
+        <w:t xml:space="preserve"> </w:t>
+      </w:r>
+      <w:r>
+        <w:t xml:space="preserve">and a</w:t>
       </w:r>
       <w:r>
         <w:t xml:space="preserve"> </w:t>
@@ -1031,13 +2282,39 @@
           <w:bCs/>
           <w:b/>
         </w:rPr>
-        <w:t xml:space="preserve">ground-station baud</w:t>
-      </w:r>
-      <w:r>
-        <w:t xml:space="preserve"> </w:t>
-      </w:r>
-      <w:r>
-        <w:t xml:space="preserve">must be identical. The firmware and ground station both default to</w:t>
+        <w:t xml:space="preserve">10 %</w:t>
+      </w:r>
+      <w:r>
+        <w:t xml:space="preserve"> </w:t>
+      </w:r>
+      <w:r>
+        <w:t xml:space="preserve">duty</w:t>
+      </w:r>
+      <w:r>
+        <w:t xml:space="preserve"> </w:t>
+      </w:r>
+      <w:r>
+        <w:t xml:space="preserve">cycle. The default power is a calculated estimate, not a measurement. Measure</w:t>
+      </w:r>
+      <w:r>
+        <w:t xml:space="preserve"> </w:t>
+      </w:r>
+      <w:r>
+        <w:t xml:space="preserve">it, or check it against the E22 datasheet’s PA gain and your antenna gain,</w:t>
+      </w:r>
+      <w:r>
+        <w:t xml:space="preserve"> </w:t>
+      </w:r>
+      <w:r>
+        <w:t xml:space="preserve">before you fly.</w:t>
+      </w:r>
+    </w:p>
+    <w:p>
+      <w:pPr>
+        <w:pStyle w:val="BodyText"/>
+      </w:pPr>
+      <w:r>
+        <w:t xml:space="preserve">The bridge always talks to the laptop at</w:t>
       </w:r>
       <w:r>
         <w:t xml:space="preserve"> </w:t>
@@ -1047,22 +2324,16 @@
           <w:bCs/>
           <w:b/>
         </w:rPr>
-        <w:t xml:space="preserve">115200</w:t>
-      </w:r>
-      <w:r>
-        <w:t xml:space="preserve">.</w:t>
-      </w:r>
-      <w:r>
-        <w:t xml:space="preserve"> </w:t>
-      </w:r>
-      <w:r>
-        <w:t xml:space="preserve">If your E22 modules are configured for a different UART baud (common factory</w:t>
-      </w:r>
-      <w:r>
-        <w:t xml:space="preserve"> </w:t>
-      </w:r>
-      <w:r>
-        <w:t xml:space="preserve">default is 9600), either reconfigure them or pass the matching</w:t>
+        <w:t xml:space="preserve">115200 baud</w:t>
+      </w:r>
+      <w:r>
+        <w:t xml:space="preserve">. Because the bridge’s</w:t>
+      </w:r>
+      <w:r>
+        <w:t xml:space="preserve"> </w:t>
+      </w:r>
+      <w:r>
+        <w:t xml:space="preserve">USB port runs at a fixed baud,</w:t>
       </w:r>
       <w:r>
         <w:t xml:space="preserve"> </w:t>
@@ -1071,55 +2342,13 @@
         <w:rPr>
           <w:rStyle w:val="VerbatimChar"/>
         </w:rPr>
-        <w:t xml:space="preserve">--baud</w:t>
-      </w:r>
-      <w:r>
-        <w:t xml:space="preserve">.</w:t>
-      </w:r>
-    </w:p>
-    <w:p>
-      <w:pPr>
-        <w:pStyle w:val="BodyText"/>
-      </w:pPr>
-      <w:r>
-        <w:t xml:space="preserve">Because the E22 in transparent mode has a</w:t>
-      </w:r>
-      <w:r>
-        <w:t xml:space="preserve"> </w:t>
-      </w:r>
-      <w:r>
-        <w:rPr>
-          <w:bCs/>
-          <w:b/>
-        </w:rPr>
-        <w:t xml:space="preserve">fixed</w:t>
-      </w:r>
-      <w:r>
-        <w:t xml:space="preserve"> </w:t>
-      </w:r>
-      <w:r>
-        <w:t xml:space="preserve">UART baud, use</w:t>
-      </w:r>
-      <w:r>
-        <w:t xml:space="preserve"> </w:t>
-      </w:r>
-      <w:r>
-        <w:rPr>
-          <w:rStyle w:val="VerbatimChar"/>
-        </w:rPr>
         <w:t xml:space="preserve">--force-baud</w:t>
       </w:r>
       <w:r>
         <w:t xml:space="preserve"> </w:t>
       </w:r>
       <w:r>
-        <w:t xml:space="preserve">so the ground station opens the port directly at that baud</w:t>
-      </w:r>
-      <w:r>
-        <w:t xml:space="preserve"> </w:t>
-      </w:r>
-      <w:r>
-        <w:t xml:space="preserve">instead of trying to auto-negotiate:</w:t>
+        <w:t xml:space="preserve">is recommended:</w:t>
       </w:r>
     </w:p>
     <w:p>
@@ -1539,7 +2768,7 @@
         <w:rPr>
           <w:rStyle w:val="CommentTok"/>
         </w:rPr>
-        <w:t xml:space="preserve"># Or specify the port/baud explicitly (recommended for E22 transparent mode):</w:t>
+        <w:t xml:space="preserve"># Or specify the port/baud explicitly (recommended for the ground bridge):</w:t>
       </w:r>
       <w:r>
         <w:br/>
@@ -1905,7 +3134,7 @@
         <w:rPr>
           <w:rStyle w:val="CommentTok"/>
         </w:rPr>
-        <w:t xml:space="preserve">     # must match the E22 UART baud</w:t>
+        <w:t xml:space="preserve">     # ground bridge USB baud</w:t>
       </w:r>
       <w:r>
         <w:br/>
@@ -1944,7 +3173,7 @@
         <w:rPr>
           <w:rStyle w:val="CommentTok"/>
         </w:rPr>
-        <w:t xml:space="preserve">     # true = open directly at baud_rate (E22 transparent)</w:t>
+        <w:t xml:space="preserve">     # true = open directly at baud_rate (recommended for the bridge)</w:t>
       </w:r>
     </w:p>
     <w:p>
@@ -2167,19 +3396,19 @@
               <w:t xml:space="preserve"> </w:t>
             </w:r>
             <w:r>
-              <w:t xml:space="preserve">but radio is plugged in</w:t>
-            </w:r>
-          </w:p>
-        </w:tc>
-        <w:tc>
-          <w:tcPr/>
-          <w:p>
-            <w:pPr>
-              <w:pStyle w:val="Compact"/>
-              <w:jc w:val="left"/>
-            </w:pPr>
-            <w:r>
-              <w:t xml:space="preserve">Wrong/aliased port — pass</w:t>
+              <w:t xml:space="preserve">but the bridge is plugged in</w:t>
+            </w:r>
+          </w:p>
+        </w:tc>
+        <w:tc>
+          <w:tcPr/>
+          <w:p>
+            <w:pPr>
+              <w:pStyle w:val="Compact"/>
+              <w:jc w:val="left"/>
+            </w:pPr>
+            <w:r>
+              <w:t xml:space="preserve">Wrong/aliased port. Pass</w:t>
             </w:r>
             <w:r>
               <w:t xml:space="preserve"> </w:t>
@@ -2194,7 +3423,7 @@
               <w:t xml:space="preserve"> </w:t>
             </w:r>
             <w:r>
-              <w:t xml:space="preserve">explicitly; check</w:t>
+              <w:t xml:space="preserve">explicitly and check</w:t>
             </w:r>
             <w:r>
               <w:t xml:space="preserve"> </w:t>
@@ -2206,7 +3435,7 @@
               <w:t xml:space="preserve">ls /dev/ttyUSB*</w:t>
             </w:r>
             <w:r>
-              <w:t xml:space="preserve">. On Linux add yourself to</w:t>
+              <w:t xml:space="preserve">. On Linux, add yourself to</w:t>
             </w:r>
             <w:r>
               <w:t xml:space="preserve"> </w:t>
@@ -2232,6 +3461,292 @@
               <w:jc w:val="left"/>
             </w:pPr>
             <w:r>
+              <w:t xml:space="preserve">Flight serial log shows</w:t>
+            </w:r>
+            <w:r>
+              <w:t xml:space="preserve"> </w:t>
+            </w:r>
+            <w:r>
+              <w:rPr>
+                <w:rStyle w:val="VerbatimChar"/>
+              </w:rPr>
+              <w:t xml:space="preserve">[RADIO] SX1268 init FAILED (-2) chip not found</w:t>
+            </w:r>
+          </w:p>
+        </w:tc>
+        <w:tc>
+          <w:tcPr/>
+          <w:p>
+            <w:pPr>
+              <w:pStyle w:val="Compact"/>
+              <w:jc w:val="left"/>
+            </w:pPr>
+            <w:r>
+              <w:rPr>
+                <w:rStyle w:val="VerbatimChar"/>
+              </w:rPr>
+              <w:t xml:space="preserve">RADIOLIB_ERR_CHIP_NOT_FOUND</w:t>
+            </w:r>
+            <w:r>
+              <w:t xml:space="preserve">: wrong NSS/BUSY pin, no power, or SPI wiring fault. Check the pin flags and the 3.3 V rail.</w:t>
+            </w:r>
+          </w:p>
+        </w:tc>
+      </w:tr>
+      <w:tr>
+        <w:tc>
+          <w:tcPr/>
+          <w:p>
+            <w:pPr>
+              <w:pStyle w:val="Compact"/>
+              <w:jc w:val="left"/>
+            </w:pPr>
+            <w:r>
+              <w:rPr>
+                <w:rStyle w:val="VerbatimChar"/>
+              </w:rPr>
+              <w:t xml:space="preserve">init FAILED (-705)</w:t>
+            </w:r>
+            <w:r>
+              <w:t xml:space="preserve"> </w:t>
+            </w:r>
+            <w:r>
+              <w:t xml:space="preserve">BUSY never released /</w:t>
+            </w:r>
+            <w:r>
+              <w:t xml:space="preserve"> </w:t>
+            </w:r>
+            <w:r>
+              <w:rPr>
+                <w:rStyle w:val="VerbatimChar"/>
+              </w:rPr>
+              <w:t xml:space="preserve">(-703)</w:t>
+            </w:r>
+            <w:r>
+              <w:t xml:space="preserve"> </w:t>
+            </w:r>
+            <w:r>
+              <w:t xml:space="preserve">invalid TCXO voltage</w:t>
+            </w:r>
+          </w:p>
+        </w:tc>
+        <w:tc>
+          <w:tcPr/>
+          <w:p>
+            <w:pPr>
+              <w:pStyle w:val="Compact"/>
+              <w:jc w:val="left"/>
+            </w:pPr>
+            <w:r>
+              <w:t xml:space="preserve">TCXO voltage or BUSY line issue. Confirm</w:t>
+            </w:r>
+            <w:r>
+              <w:t xml:space="preserve"> </w:t>
+            </w:r>
+            <w:r>
+              <w:rPr>
+                <w:rStyle w:val="VerbatimChar"/>
+              </w:rPr>
+              <w:t xml:space="preserve">RADIO_TCXO_V</w:t>
+            </w:r>
+            <w:r>
+              <w:t xml:space="preserve"> </w:t>
+            </w:r>
+            <w:r>
+              <w:t xml:space="preserve">against the E22 datasheet and that BUSY goes to the configured GPIO.</w:t>
+            </w:r>
+          </w:p>
+        </w:tc>
+      </w:tr>
+      <w:tr>
+        <w:tc>
+          <w:tcPr/>
+          <w:p>
+            <w:pPr>
+              <w:pStyle w:val="Compact"/>
+              <w:jc w:val="left"/>
+            </w:pPr>
+            <w:r>
+              <w:t xml:space="preserve">Type</w:t>
+            </w:r>
+            <w:r>
+              <w:t xml:space="preserve"> </w:t>
+            </w:r>
+            <w:r>
+              <w:rPr>
+                <w:rStyle w:val="VerbatimChar"/>
+              </w:rPr>
+              <w:t xml:space="preserve">L</w:t>
+            </w:r>
+            <w:r>
+              <w:t xml:space="preserve"> </w:t>
+            </w:r>
+            <w:r>
+              <w:t xml:space="preserve">in the flight serial console</w:t>
+            </w:r>
+          </w:p>
+        </w:tc>
+        <w:tc>
+          <w:tcPr/>
+          <w:p>
+            <w:pPr>
+              <w:pStyle w:val="Compact"/>
+              <w:jc w:val="left"/>
+            </w:pPr>
+            <w:r>
+              <w:t xml:space="preserve">Prints storage status and radio status (</w:t>
+            </w:r>
+            <w:r>
+              <w:rPr>
+                <w:rStyle w:val="VerbatimChar"/>
+              </w:rPr>
+              <w:t xml:space="preserve">tx</w:t>
+            </w:r>
+            <w:r>
+              <w:t xml:space="preserve">,</w:t>
+            </w:r>
+            <w:r>
+              <w:t xml:space="preserve"> </w:t>
+            </w:r>
+            <w:r>
+              <w:rPr>
+                <w:rStyle w:val="VerbatimChar"/>
+              </w:rPr>
+              <w:t xml:space="preserve">skipped(duty/busy)</w:t>
+            </w:r>
+            <w:r>
+              <w:t xml:space="preserve">,</w:t>
+            </w:r>
+            <w:r>
+              <w:t xml:space="preserve"> </w:t>
+            </w:r>
+            <w:r>
+              <w:rPr>
+                <w:rStyle w:val="VerbatimChar"/>
+              </w:rPr>
+              <w:t xml:space="preserve">errors</w:t>
+            </w:r>
+            <w:r>
+              <w:t xml:space="preserve">,</w:t>
+            </w:r>
+            <w:r>
+              <w:t xml:space="preserve"> </w:t>
+            </w:r>
+            <w:r>
+              <w:rPr>
+                <w:rStyle w:val="VerbatimChar"/>
+              </w:rPr>
+              <w:t xml:space="preserve">last_err</w:t>
+            </w:r>
+            <w:r>
+              <w:t xml:space="preserve">). Use it to see whether frames are actually being sent.</w:t>
+            </w:r>
+          </w:p>
+        </w:tc>
+      </w:tr>
+      <w:tr>
+        <w:tc>
+          <w:tcPr/>
+          <w:p>
+            <w:pPr>
+              <w:pStyle w:val="Compact"/>
+              <w:jc w:val="left"/>
+            </w:pPr>
+            <w:r>
+              <w:t xml:space="preserve">Bridge receives nothing</w:t>
+            </w:r>
+          </w:p>
+        </w:tc>
+        <w:tc>
+          <w:tcPr/>
+          <w:p>
+            <w:pPr>
+              <w:pStyle w:val="Compact"/>
+              <w:jc w:val="left"/>
+            </w:pPr>
+            <w:r>
+              <w:t xml:space="preserve">LoRa parameter mismatch (frequency/SF/BW/sync word/CR). Both builds must use the same</w:t>
+            </w:r>
+            <w:r>
+              <w:t xml:space="preserve"> </w:t>
+            </w:r>
+            <w:r>
+              <w:rPr>
+                <w:rStyle w:val="VerbatimChar"/>
+              </w:rPr>
+              <w:t xml:space="preserve">airone_radio.h</w:t>
+            </w:r>
+            <w:r>
+              <w:t xml:space="preserve">. Also check the RXEN/TXEN wiring, because an RF switch left in the wrong state means no RX.</w:t>
+            </w:r>
+          </w:p>
+        </w:tc>
+      </w:tr>
+      <w:tr>
+        <w:tc>
+          <w:tcPr/>
+          <w:p>
+            <w:pPr>
+              <w:pStyle w:val="Compact"/>
+              <w:jc w:val="left"/>
+            </w:pPr>
+            <w:r>
+              <w:t xml:space="preserve">Bridge receives frames but forwards none</w:t>
+            </w:r>
+          </w:p>
+        </w:tc>
+        <w:tc>
+          <w:tcPr/>
+          <w:p>
+            <w:pPr>
+              <w:pStyle w:val="Compact"/>
+              <w:jc w:val="left"/>
+            </w:pPr>
+            <w:r>
+              <w:t xml:space="preserve">HMAC key mismatch (frames fail verification) or duplicate sequence numbers. Rebuild with</w:t>
+            </w:r>
+            <w:r>
+              <w:t xml:space="preserve"> </w:t>
+            </w:r>
+            <w:r>
+              <w:rPr>
+                <w:rStyle w:val="VerbatimChar"/>
+              </w:rPr>
+              <w:t xml:space="preserve">-DBRIDGE_DEBUG=1</w:t>
+            </w:r>
+            <w:r>
+              <w:t xml:space="preserve"> </w:t>
+            </w:r>
+            <w:r>
+              <w:t xml:space="preserve">and watch the</w:t>
+            </w:r>
+            <w:r>
+              <w:t xml:space="preserve"> </w:t>
+            </w:r>
+            <w:r>
+              <w:rPr>
+                <w:rStyle w:val="VerbatimChar"/>
+              </w:rPr>
+              <w:t xml:space="preserve">#RX bad frame</w:t>
+            </w:r>
+            <w:r>
+              <w:t xml:space="preserve"> </w:t>
+            </w:r>
+            <w:r>
+              <w:t xml:space="preserve">lines.</w:t>
+            </w:r>
+          </w:p>
+        </w:tc>
+      </w:tr>
+      <w:tr>
+        <w:tc>
+          <w:tcPr/>
+          <w:p>
+            <w:pPr>
+              <w:pStyle w:val="Compact"/>
+              <w:jc w:val="left"/>
+            </w:pPr>
+            <w:r>
               <w:t xml:space="preserve">Port opens but</w:t>
             </w:r>
             <w:r>
@@ -2259,7 +3774,7 @@
               <w:jc w:val="left"/>
             </w:pPr>
             <w:r>
-              <w:t xml:space="preserve">Baud mismatch — use</w:t>
+              <w:t xml:space="preserve">Use</w:t>
             </w:r>
             <w:r>
               <w:t xml:space="preserve"> </w:t>
@@ -2268,25 +3783,63 @@
               <w:rPr>
                 <w:rStyle w:val="VerbatimChar"/>
               </w:rPr>
-              <w:t xml:space="preserve">--baud</w:t>
-            </w:r>
-            <w:r>
-              <w:t xml:space="preserve"> </w:t>
-            </w:r>
-            <w:r>
-              <w:t xml:space="preserve">to match the E22 UART; add</w:t>
-            </w:r>
-            <w:r>
-              <w:t xml:space="preserve"> </w:t>
+              <w:t xml:space="preserve">--baud 115200 --force-baud</w:t>
+            </w:r>
+            <w:r>
+              <w:t xml:space="preserve">. Confirm the CanSat is powered and transmitting (</w:t>
             </w:r>
             <w:r>
               <w:rPr>
                 <w:rStyle w:val="VerbatimChar"/>
               </w:rPr>
-              <w:t xml:space="preserve">--force-baud</w:t>
-            </w:r>
-            <w:r>
-              <w:t xml:space="preserve">. Confirm the CanSat is powered and transmitting.</w:t>
+              <w:t xml:space="preserve">L</w:t>
+            </w:r>
+            <w:r>
+              <w:t xml:space="preserve"> </w:t>
+            </w:r>
+            <w:r>
+              <w:t xml:space="preserve">shows</w:t>
+            </w:r>
+            <w:r>
+              <w:t xml:space="preserve"> </w:t>
+            </w:r>
+            <w:r>
+              <w:rPr>
+                <w:rStyle w:val="VerbatimChar"/>
+              </w:rPr>
+              <w:t xml:space="preserve">tx=</w:t>
+            </w:r>
+            <w:r>
+              <w:t xml:space="preserve"> </w:t>
+            </w:r>
+            <w:r>
+              <w:t xml:space="preserve">counting up).</w:t>
+            </w:r>
+          </w:p>
+        </w:tc>
+      </w:tr>
+      <w:tr>
+        <w:tc>
+          <w:tcPr/>
+          <w:p>
+            <w:pPr>
+              <w:pStyle w:val="Compact"/>
+              <w:jc w:val="left"/>
+            </w:pPr>
+            <w:r>
+              <w:t xml:space="preserve">Updates arrive about every 1.6 s, not 2 Hz</w:t>
+            </w:r>
+          </w:p>
+        </w:tc>
+        <w:tc>
+          <w:tcPr/>
+          <w:p>
+            <w:pPr>
+              <w:pStyle w:val="Compact"/>
+              <w:jc w:val="left"/>
+            </w:pPr>
+            <w:r>
+              <w:t xml:space="preserve">Expected. The 10 % duty-cycle limiter sets the air rate. The full 2 Hz record is on MicroSD/flash.</w:t>
             </w:r>
           </w:p>
         </w:tc>
@@ -2321,7 +3874,7 @@
               <w:jc w:val="left"/>
             </w:pPr>
             <w:r>
-              <w:t xml:space="preserve">RF interference / weak link / partial frames — check antennas, reduce distance, confirm both E22s share channel/address/air-rate.</w:t>
+              <w:t xml:space="preserve">RF interference / weak link. Check antennas and distance. Note that the bridge already discards bad frames before USB.</w:t>
             </w:r>
           </w:p>
         </w:tc>
@@ -2347,7 +3900,7 @@
               <w:jc w:val="left"/>
             </w:pPr>
             <w:r>
-              <w:t xml:space="preserve">Link dropped — the receiver auto-reconnects with backoff; check power/USB.</w:t>
+              <w:t xml:space="preserve">Link dropped. The receiver auto-reconnects with backoff. Check power/USB.</w:t>
             </w:r>
             <w:r>
               <w:t xml:space="preserve"> </w:t>
@@ -2454,7 +4007,19 @@
               <w:t xml:space="preserve"> </w:t>
             </w:r>
             <w:r>
-              <w:t xml:space="preserve">frame format — expected. Do not use a text serial monitor to validate; use the AirOne ground station.</w:t>
+              <w:t xml:space="preserve">frame format, which is expected. Use the AirOne ground station, or build the bridge with</w:t>
+            </w:r>
+            <w:r>
+              <w:t xml:space="preserve"> </w:t>
+            </w:r>
+            <w:r>
+              <w:rPr>
+                <w:rStyle w:val="VerbatimChar"/>
+              </w:rPr>
+              <w:t xml:space="preserve">BRIDGE_DEBUG=1</w:t>
+            </w:r>
+            <w:r>
+              <w:t xml:space="preserve">.</w:t>
             </w:r>
           </w:p>
         </w:tc>

</xml_diff>